<commit_message>
Bump version to 2.0.2; migrate API to PostgreSQL; set Status/EndDateTime in Abrechnung
</commit_message>
<xml_diff>
--- a/data/Preisliste_Vorlage.docx
+++ b/data/Preisliste_Vorlage.docx
@@ -72,7 +72,7 @@
         <w:tabs>
           <w:tab w:val="right" w:pos="8460"/>
         </w:tabs>
-        <w:spacing w:after="0"/>
+        <w:spacing w:after="0" w:line="240" w:lineRule="auto"/>
         <w:ind w:left="-227"/>
         <w:jc w:val="center"/>
         <w:rPr>
@@ -2112,6 +2112,7 @@
     <w:rsid w:val="00915517"/>
     <w:rsid w:val="00915778"/>
     <w:rsid w:val="00936749"/>
+    <w:rsid w:val="009735E3"/>
     <w:rsid w:val="00A01071"/>
     <w:rsid w:val="00A639EE"/>
     <w:rsid w:val="00A8273A"/>
@@ -2129,6 +2130,7 @@
     <w:rsid w:val="00D33966"/>
     <w:rsid w:val="00D82F80"/>
     <w:rsid w:val="00DA4DC0"/>
+    <w:rsid w:val="00DB19AC"/>
     <w:rsid w:val="00DB574B"/>
     <w:rsid w:val="00DC61BE"/>
     <w:rsid w:val="00DE6AAF"/>

</xml_diff>